<commit_message>
Apply Guevara's handwritten review: strike shoot/strike threats he did not hear
Per Guevara's markup on the printed draft: removed 'at barilin kita' /
'or I will shoot you' (para 2) and 'Patitirahin kita' / 'I will strike
you' (para 5) from HIS statement only, keeping the curses, 'Manloloko,
magnanakaw', and 'Anong gusto mo?'; added his handwritten residence
(2649 N. Dominga St., Pasay City - verify vs ID at jurat). Bangasan's
and Allan's statements deliberately unchanged - honest witness
divergence, flagged in Part III #0. Regenerated Guevara docx and the
19-page PDF packet.

Co-Authored-By: Claude Fable 5 <noreply@anthropic.com>
Claude-Session: https://claude.ai/code/session_01UpQ6SZaDgERSUKhzTqk5Nt
</commit_message>
<xml_diff>
--- a/case_work/Paracale-001/WITNESS_AFFIDAVIT_GUEVARA_2026-09-05.docx
+++ b/case_work/Paracale-001/WITNESS_AFFIDAVIT_GUEVARA_2026-09-05.docx
@@ -118,7 +118,7 @@
           <w:sz w:val="24"/>
           <w:szCs w:val="24"/>
         </w:rPr>
-        <w:t xml:space="preserve"> (PRC License No. ____________), with residence at ______________________________________________, after having been duly sworn to in accordance with law, hereby depose and state:</w:t>
+        <w:t xml:space="preserve"> (PRC License No. ____________), with residence at 2649 N. Dominga Street, Pasay City, NCR, after having been duly sworn to in accordance with law, hereby depose and state:</w:t>
       </w:r>
     </w:p>
     <w:p>
@@ -230,15 +230,15 @@
           <w:sz w:val="24"/>
           <w:szCs w:val="24"/>
         </w:rPr>
-        <w:t xml:space="preserve">“Umalis ka dito at barilin kita! Putang ina mo, hayop ka! Manloloko, magnanakaw! Alis kayo dito!”</w:t>
-      </w:r>
-      <w:r>
-        <w:rPr>
-          <w:rFonts w:ascii="Times New Roman" w:cs="Times New Roman" w:eastAsia="Times New Roman" w:hAnsi="Times New Roman"/>
-          <w:sz w:val="24"/>
-          <w:szCs w:val="24"/>
-        </w:rPr>
-        <w:t xml:space="preserve"> (in English: “Leave this place or I will shoot you! You son of a whore, you animal! Swindler, thief! All of you, get out of here!”).</w:t>
+        <w:t xml:space="preserve">“Umalis ka dito! Putang ina mo, hayop ka! Manloloko, magnanakaw! Alis kayo dito!”</w:t>
+      </w:r>
+      <w:r>
+        <w:rPr>
+          <w:rFonts w:ascii="Times New Roman" w:cs="Times New Roman" w:eastAsia="Times New Roman" w:hAnsi="Times New Roman"/>
+          <w:sz w:val="24"/>
+          <w:szCs w:val="24"/>
+        </w:rPr>
+        <w:t xml:space="preserve"> (in English: “Leave this place! You son of a whore, you animal! Swindler, thief! All of you, get out of here!”).</w:t>
       </w:r>
     </w:p>
     <w:p>
@@ -293,15 +293,15 @@
           <w:sz w:val="24"/>
           <w:szCs w:val="24"/>
         </w:rPr>
-        <w:t xml:space="preserve">“Anong gusto mo? Patitirahin kita!”</w:t>
-      </w:r>
-      <w:r>
-        <w:rPr>
-          <w:rFonts w:ascii="Times New Roman" w:cs="Times New Roman" w:eastAsia="Times New Roman" w:hAnsi="Times New Roman"/>
-          <w:sz w:val="24"/>
-          <w:szCs w:val="24"/>
-        </w:rPr>
-        <w:t xml:space="preserve"> (in English: “What do you want? I will strike you!”).</w:t>
+        <w:t xml:space="preserve">“Anong gusto mo?”</w:t>
+      </w:r>
+      <w:r>
+        <w:rPr>
+          <w:rFonts w:ascii="Times New Roman" w:cs="Times New Roman" w:eastAsia="Times New Roman" w:hAnsi="Times New Roman"/>
+          <w:sz w:val="24"/>
+          <w:szCs w:val="24"/>
+        </w:rPr>
+        <w:t xml:space="preserve"> (in English: “What do you want?”).</w:t>
       </w:r>
     </w:p>
     <w:p>

</xml_diff>